<commit_message>
chore: publish full project updates
Include backend, frontend build artifacts, docs, scripts, and configuration changes for the latest dashboard, reporting, and operational workflow updates.

Made-with: Cursor
</commit_message>
<xml_diff>
--- a/FLUXOGRAMA OPERACIONAL.docx
+++ b/FLUXOGRAMA OPERACIONAL.docx
@@ -192,7 +192,61 @@
           <w:sz w:val="24"/>
           <w:szCs w:val="24"/>
         </w:rPr>
-        <w:t>Clienteinteressadoemcr</w:t>
+        <w:t>Cliente</w:t>
+      </w:r>
+      <w:r>
+        <w:rPr>
+          <w:rStyle w:val="hljs-variable"/>
+          <w:rFonts w:ascii="Times New Roman" w:hAnsi="Times New Roman" w:cs="Times New Roman"/>
+          <w:sz w:val="24"/>
+          <w:szCs w:val="24"/>
+        </w:rPr>
+        <w:t xml:space="preserve"> </w:t>
+      </w:r>
+      <w:r>
+        <w:rPr>
+          <w:rStyle w:val="hljs-variable"/>
+          <w:rFonts w:ascii="Times New Roman" w:hAnsi="Times New Roman" w:cs="Times New Roman"/>
+          <w:sz w:val="24"/>
+          <w:szCs w:val="24"/>
+        </w:rPr>
+        <w:t>interessado</w:t>
+      </w:r>
+      <w:r>
+        <w:rPr>
+          <w:rStyle w:val="hljs-variable"/>
+          <w:rFonts w:ascii="Times New Roman" w:hAnsi="Times New Roman" w:cs="Times New Roman"/>
+          <w:sz w:val="24"/>
+          <w:szCs w:val="24"/>
+        </w:rPr>
+        <w:t xml:space="preserve"> </w:t>
+      </w:r>
+      <w:r>
+        <w:rPr>
+          <w:rStyle w:val="hljs-variable"/>
+          <w:rFonts w:ascii="Times New Roman" w:hAnsi="Times New Roman" w:cs="Times New Roman"/>
+          <w:sz w:val="24"/>
+          <w:szCs w:val="24"/>
+        </w:rPr>
+        <w:t>em</w:t>
+      </w:r>
+      <w:r>
+        <w:rPr>
+          <w:rStyle w:val="hljs-variable"/>
+          <w:rFonts w:ascii="Times New Roman" w:hAnsi="Times New Roman" w:cs="Times New Roman"/>
+          <w:sz w:val="24"/>
+          <w:szCs w:val="24"/>
+        </w:rPr>
+        <w:t xml:space="preserve"> </w:t>
+      </w:r>
+      <w:r>
+        <w:rPr>
+          <w:rStyle w:val="hljs-variable"/>
+          <w:rFonts w:ascii="Times New Roman" w:hAnsi="Times New Roman" w:cs="Times New Roman"/>
+          <w:sz w:val="24"/>
+          <w:szCs w:val="24"/>
+        </w:rPr>
+        <w:t>cr</w:t>
       </w:r>
       <w:r>
         <w:rPr>
@@ -259,7 +313,25 @@
           <w:sz w:val="24"/>
           <w:szCs w:val="24"/>
         </w:rPr>
-        <w:t>ComunidadeRural</w:t>
+        <w:t>Comunidade</w:t>
+      </w:r>
+      <w:r>
+        <w:rPr>
+          <w:rStyle w:val="hljs-variable"/>
+          <w:rFonts w:ascii="Times New Roman" w:hAnsi="Times New Roman" w:cs="Times New Roman"/>
+          <w:sz w:val="24"/>
+          <w:szCs w:val="24"/>
+        </w:rPr>
+        <w:t xml:space="preserve"> </w:t>
+      </w:r>
+      <w:r>
+        <w:rPr>
+          <w:rStyle w:val="hljs-variable"/>
+          <w:rFonts w:ascii="Times New Roman" w:hAnsi="Times New Roman" w:cs="Times New Roman"/>
+          <w:sz w:val="24"/>
+          <w:szCs w:val="24"/>
+        </w:rPr>
+        <w:t>Rural</w:t>
       </w:r>
       <w:r>
         <w:rPr>
@@ -315,6 +387,208 @@
           <w:sz w:val="24"/>
           <w:szCs w:val="24"/>
         </w:rPr>
+        <w:t>Taxa</w:t>
+      </w:r>
+      <w:r>
+        <w:rPr>
+          <w:rStyle w:val="hljs-variable"/>
+          <w:rFonts w:ascii="Times New Roman" w:hAnsi="Times New Roman" w:cs="Times New Roman"/>
+          <w:sz w:val="24"/>
+          <w:szCs w:val="24"/>
+        </w:rPr>
+        <w:t xml:space="preserve"> </w:t>
+      </w:r>
+      <w:r>
+        <w:rPr>
+          <w:rStyle w:val="hljs-variable"/>
+          <w:rFonts w:ascii="Times New Roman" w:hAnsi="Times New Roman" w:cs="Times New Roman"/>
+          <w:sz w:val="24"/>
+          <w:szCs w:val="24"/>
+        </w:rPr>
+        <w:t>de</w:t>
+      </w:r>
+      <w:r>
+        <w:rPr>
+          <w:rStyle w:val="hljs-variable"/>
+          <w:rFonts w:ascii="Times New Roman" w:hAnsi="Times New Roman" w:cs="Times New Roman"/>
+          <w:sz w:val="24"/>
+          <w:szCs w:val="24"/>
+        </w:rPr>
+        <w:t xml:space="preserve"> </w:t>
+      </w:r>
+      <w:r>
+        <w:rPr>
+          <w:rStyle w:val="hljs-variable"/>
+          <w:rFonts w:ascii="Times New Roman" w:hAnsi="Times New Roman" w:cs="Times New Roman"/>
+          <w:sz w:val="24"/>
+          <w:szCs w:val="24"/>
+        </w:rPr>
+        <w:t>juro</w:t>
+      </w:r>
+      <w:r>
+        <w:rPr>
+          <w:rStyle w:val="hljs-operator"/>
+          <w:rFonts w:ascii="Times New Roman" w:hAnsi="Times New Roman" w:cs="Times New Roman"/>
+          <w:sz w:val="24"/>
+          <w:szCs w:val="24"/>
+        </w:rPr>
+        <w:t>:</w:t>
+      </w:r>
+      <w:r>
+        <w:rPr>
+          <w:rStyle w:val="hljs-operator"/>
+          <w:rFonts w:ascii="Times New Roman" w:hAnsi="Times New Roman" w:cs="Times New Roman"/>
+          <w:sz w:val="24"/>
+          <w:szCs w:val="24"/>
+        </w:rPr>
+        <w:t xml:space="preserve"> </w:t>
+      </w:r>
+      <w:r>
+        <w:rPr>
+          <w:rStyle w:val="hljs-number"/>
+          <w:rFonts w:ascii="Times New Roman" w:hAnsi="Times New Roman" w:cs="Times New Roman"/>
+          <w:sz w:val="24"/>
+          <w:szCs w:val="24"/>
+        </w:rPr>
+        <w:t>2</w:t>
+      </w:r>
+      <w:r>
+        <w:rPr>
+          <w:rStyle w:val="hljs-operator"/>
+          <w:rFonts w:ascii="Times New Roman" w:hAnsi="Times New Roman" w:cs="Times New Roman"/>
+          <w:sz w:val="24"/>
+          <w:szCs w:val="24"/>
+        </w:rPr>
+        <w:t>%</w:t>
+      </w:r>
+    </w:p>
+    <w:p>
+      <w:pPr>
+        <w:pStyle w:val="HTMLPreformatted"/>
+        <w:rPr>
+          <w:rStyle w:val="HTMLCode"/>
+          <w:rFonts w:ascii="Times New Roman" w:hAnsi="Times New Roman" w:cs="Times New Roman"/>
+          <w:sz w:val="24"/>
+          <w:szCs w:val="24"/>
+        </w:rPr>
+      </w:pPr>
+      <w:r>
+        <w:rPr>
+          <w:rStyle w:val="HTMLCode"/>
+          <w:rFonts w:ascii="Times New Roman" w:hAnsi="Times New Roman" w:cs="Times New Roman"/>
+          <w:sz w:val="24"/>
+          <w:szCs w:val="24"/>
+        </w:rPr>
+        <w:t xml:space="preserve">  └─ </w:t>
+      </w:r>
+      <w:r>
+        <w:rPr>
+          <w:rStyle w:val="hljs-builtin"/>
+          <w:rFonts w:ascii="Times New Roman" w:hAnsi="Times New Roman" w:cs="Times New Roman"/>
+          <w:sz w:val="24"/>
+          <w:szCs w:val="24"/>
+        </w:rPr>
+        <w:t>N</w:t>
+      </w:r>
+      <w:r>
+        <w:rPr>
+          <w:rStyle w:val="HTMLCode"/>
+          <w:rFonts w:ascii="Times New Roman" w:hAnsi="Times New Roman" w:cs="Times New Roman"/>
+          <w:sz w:val="24"/>
+          <w:szCs w:val="24"/>
+        </w:rPr>
+        <w:t>ã</w:t>
+      </w:r>
+      <w:r>
+        <w:rPr>
+          <w:rStyle w:val="hljs-variable"/>
+          <w:rFonts w:ascii="Times New Roman" w:hAnsi="Times New Roman" w:cs="Times New Roman"/>
+          <w:sz w:val="24"/>
+          <w:szCs w:val="24"/>
+        </w:rPr>
+        <w:t>o</w:t>
+      </w:r>
+      <w:r>
+        <w:rPr>
+          <w:rStyle w:val="HTMLCode"/>
+          <w:rFonts w:ascii="Times New Roman" w:hAnsi="Times New Roman" w:cs="Times New Roman"/>
+          <w:sz w:val="24"/>
+          <w:szCs w:val="24"/>
+        </w:rPr>
+        <w:t>→ É</w:t>
+      </w:r>
+      <w:r>
+        <w:rPr>
+          <w:rStyle w:val="HTMLCode"/>
+          <w:rFonts w:ascii="Times New Roman" w:hAnsi="Times New Roman" w:cs="Times New Roman"/>
+          <w:sz w:val="24"/>
+          <w:szCs w:val="24"/>
+        </w:rPr>
+        <w:t xml:space="preserve"> </w:t>
+      </w:r>
+      <w:r>
+        <w:rPr>
+          <w:rStyle w:val="hljs-variable"/>
+          <w:rFonts w:ascii="Times New Roman" w:hAnsi="Times New Roman" w:cs="Times New Roman"/>
+          <w:sz w:val="24"/>
+          <w:szCs w:val="24"/>
+        </w:rPr>
+        <w:t>MPME</w:t>
+      </w:r>
+      <w:r>
+        <w:rPr>
+          <w:rStyle w:val="hljs-operator"/>
+          <w:rFonts w:ascii="Times New Roman" w:hAnsi="Times New Roman" w:cs="Times New Roman"/>
+          <w:sz w:val="24"/>
+          <w:szCs w:val="24"/>
+        </w:rPr>
+        <w:t>?</w:t>
+      </w:r>
+    </w:p>
+    <w:p>
+      <w:pPr>
+        <w:pStyle w:val="HTMLPreformatted"/>
+        <w:rPr>
+          <w:rStyle w:val="HTMLCode"/>
+          <w:rFonts w:ascii="Times New Roman" w:hAnsi="Times New Roman" w:cs="Times New Roman"/>
+          <w:sz w:val="24"/>
+          <w:szCs w:val="24"/>
+        </w:rPr>
+      </w:pPr>
+      <w:r>
+        <w:rPr>
+          <w:rStyle w:val="HTMLCode"/>
+          <w:rFonts w:ascii="Times New Roman" w:hAnsi="Times New Roman" w:cs="Times New Roman"/>
+          <w:sz w:val="24"/>
+          <w:szCs w:val="24"/>
+        </w:rPr>
+        <w:t xml:space="preserve">            ├─ </w:t>
+      </w:r>
+      <w:r>
+        <w:rPr>
+          <w:rStyle w:val="hljs-variable"/>
+          <w:rFonts w:ascii="Times New Roman" w:hAnsi="Times New Roman" w:cs="Times New Roman"/>
+          <w:sz w:val="24"/>
+          <w:szCs w:val="24"/>
+        </w:rPr>
+        <w:t>Sim</w:t>
+      </w:r>
+      <w:r>
+        <w:rPr>
+          <w:rStyle w:val="HTMLCode"/>
+          <w:rFonts w:ascii="Times New Roman" w:hAnsi="Times New Roman" w:cs="Times New Roman"/>
+          <w:sz w:val="24"/>
+          <w:szCs w:val="24"/>
+        </w:rPr>
+        <w:t xml:space="preserve"> → </w:t>
+      </w:r>
+      <w:r>
+        <w:rPr>
+          <w:rStyle w:val="hljs-variable"/>
+          <w:rFonts w:ascii="Times New Roman" w:hAnsi="Times New Roman" w:cs="Times New Roman"/>
+          <w:sz w:val="24"/>
+          <w:szCs w:val="24"/>
+        </w:rPr>
         <w:t>Taxadejuro</w:t>
       </w:r>
       <w:r>
@@ -328,12 +602,21 @@
       </w:r>
       <w:r>
         <w:rPr>
+          <w:rStyle w:val="hljs-operator"/>
+          <w:rFonts w:ascii="Times New Roman" w:hAnsi="Times New Roman" w:cs="Times New Roman"/>
+          <w:sz w:val="24"/>
+          <w:szCs w:val="24"/>
+        </w:rPr>
+        <w:t xml:space="preserve"> </w:t>
+      </w:r>
+      <w:r>
+        <w:rPr>
           <w:rStyle w:val="hljs-number"/>
           <w:rFonts w:ascii="Times New Roman" w:hAnsi="Times New Roman" w:cs="Times New Roman"/>
           <w:sz w:val="24"/>
           <w:szCs w:val="24"/>
         </w:rPr>
-        <w:t>2</w:t>
+        <w:t>9</w:t>
       </w:r>
       <w:r>
         <w:rPr>
@@ -349,20 +632,20 @@
       <w:pPr>
         <w:pStyle w:val="HTMLPreformatted"/>
         <w:rPr>
-          <w:rStyle w:val="HTMLCode"/>
-          <w:rFonts w:ascii="Times New Roman" w:hAnsi="Times New Roman" w:cs="Times New Roman"/>
-          <w:sz w:val="24"/>
-          <w:szCs w:val="24"/>
-        </w:rPr>
-      </w:pPr>
-      <w:r>
-        <w:rPr>
-          <w:rStyle w:val="HTMLCode"/>
-          <w:rFonts w:ascii="Times New Roman" w:hAnsi="Times New Roman" w:cs="Times New Roman"/>
-          <w:sz w:val="24"/>
-          <w:szCs w:val="24"/>
-        </w:rPr>
-        <w:t xml:space="preserve">  └─ </w:t>
+          <w:rStyle w:val="hljs-variable"/>
+          <w:rFonts w:ascii="Times New Roman" w:hAnsi="Times New Roman" w:cs="Times New Roman"/>
+          <w:sz w:val="24"/>
+          <w:szCs w:val="24"/>
+        </w:rPr>
+      </w:pPr>
+      <w:r>
+        <w:rPr>
+          <w:rStyle w:val="HTMLCode"/>
+          <w:rFonts w:ascii="Times New Roman" w:hAnsi="Times New Roman" w:cs="Times New Roman"/>
+          <w:sz w:val="24"/>
+          <w:szCs w:val="24"/>
+        </w:rPr>
+        <w:t xml:space="preserve">            └─ </w:t>
       </w:r>
       <w:r>
         <w:rPr>
@@ -398,7 +681,7 @@
           <w:sz w:val="24"/>
           <w:szCs w:val="24"/>
         </w:rPr>
-        <w:t>→ É</w:t>
+        <w:t xml:space="preserve"> → </w:t>
       </w:r>
       <w:r>
         <w:rPr>
@@ -407,36 +690,7 @@
           <w:sz w:val="24"/>
           <w:szCs w:val="24"/>
         </w:rPr>
-        <w:t>MPME</w:t>
-      </w:r>
-      <w:r>
-        <w:rPr>
-          <w:rStyle w:val="hljs-operator"/>
-          <w:rFonts w:ascii="Times New Roman" w:hAnsi="Times New Roman" w:cs="Times New Roman"/>
-          <w:sz w:val="24"/>
-          <w:szCs w:val="24"/>
-        </w:rPr>
-        <w:t>?</w:t>
-      </w:r>
-    </w:p>
-    <w:p>
-      <w:pPr>
-        <w:pStyle w:val="HTMLPreformatted"/>
-        <w:rPr>
-          <w:rStyle w:val="HTMLCode"/>
-          <w:rFonts w:ascii="Times New Roman" w:hAnsi="Times New Roman" w:cs="Times New Roman"/>
-          <w:sz w:val="24"/>
-          <w:szCs w:val="24"/>
-        </w:rPr>
-      </w:pPr>
-      <w:r>
-        <w:rPr>
-          <w:rStyle w:val="HTMLCode"/>
-          <w:rFonts w:ascii="Times New Roman" w:hAnsi="Times New Roman" w:cs="Times New Roman"/>
-          <w:sz w:val="24"/>
-          <w:szCs w:val="24"/>
-        </w:rPr>
-        <w:t xml:space="preserve">            ├─ </w:t>
+        <w:t>Processo</w:t>
       </w:r>
       <w:r>
         <w:rPr>
@@ -445,16 +699,7 @@
           <w:sz w:val="24"/>
           <w:szCs w:val="24"/>
         </w:rPr>
-        <w:t>Sim</w:t>
-      </w:r>
-      <w:r>
-        <w:rPr>
-          <w:rStyle w:val="HTMLCode"/>
-          <w:rFonts w:ascii="Times New Roman" w:hAnsi="Times New Roman" w:cs="Times New Roman"/>
-          <w:sz w:val="24"/>
-          <w:szCs w:val="24"/>
-        </w:rPr>
-        <w:t xml:space="preserve"> → </w:t>
+        <w:t xml:space="preserve"> </w:t>
       </w:r>
       <w:r>
         <w:rPr>
@@ -463,72 +708,25 @@
           <w:sz w:val="24"/>
           <w:szCs w:val="24"/>
         </w:rPr>
-        <w:t>Taxadejuro</w:t>
-      </w:r>
-      <w:r>
-        <w:rPr>
-          <w:rStyle w:val="hljs-operator"/>
-          <w:rFonts w:ascii="Times New Roman" w:hAnsi="Times New Roman" w:cs="Times New Roman"/>
-          <w:sz w:val="24"/>
-          <w:szCs w:val="24"/>
-        </w:rPr>
-        <w:t>:</w:t>
-      </w:r>
-      <w:r>
-        <w:rPr>
-          <w:rStyle w:val="hljs-number"/>
-          <w:rFonts w:ascii="Times New Roman" w:hAnsi="Times New Roman" w:cs="Times New Roman"/>
-          <w:sz w:val="24"/>
-          <w:szCs w:val="24"/>
-        </w:rPr>
-        <w:t>9</w:t>
-      </w:r>
-      <w:r>
-        <w:rPr>
-          <w:rStyle w:val="hljs-operator"/>
-          <w:rFonts w:ascii="Times New Roman" w:hAnsi="Times New Roman" w:cs="Times New Roman"/>
-          <w:sz w:val="24"/>
-          <w:szCs w:val="24"/>
-        </w:rPr>
-        <w:t>%</w:t>
-      </w:r>
-    </w:p>
-    <w:p>
-      <w:pPr>
-        <w:pStyle w:val="HTMLPreformatted"/>
+        <w:t>n</w:t>
+      </w:r>
+      <w:r>
+        <w:rPr>
+          <w:rStyle w:val="HTMLCode"/>
+          <w:rFonts w:ascii="Times New Roman" w:hAnsi="Times New Roman" w:cs="Times New Roman"/>
+          <w:sz w:val="24"/>
+          <w:szCs w:val="24"/>
+        </w:rPr>
+        <w:t>ã</w:t>
+      </w:r>
+      <w:r>
         <w:rPr>
           <w:rStyle w:val="hljs-variable"/>
           <w:rFonts w:ascii="Times New Roman" w:hAnsi="Times New Roman" w:cs="Times New Roman"/>
           <w:sz w:val="24"/>
           <w:szCs w:val="24"/>
         </w:rPr>
-      </w:pPr>
-      <w:r>
-        <w:rPr>
-          <w:rStyle w:val="HTMLCode"/>
-          <w:rFonts w:ascii="Times New Roman" w:hAnsi="Times New Roman" w:cs="Times New Roman"/>
-          <w:sz w:val="24"/>
-          <w:szCs w:val="24"/>
-        </w:rPr>
-        <w:t xml:space="preserve">            └─ </w:t>
-      </w:r>
-      <w:r>
-        <w:rPr>
-          <w:rStyle w:val="hljs-builtin"/>
-          <w:rFonts w:ascii="Times New Roman" w:hAnsi="Times New Roman" w:cs="Times New Roman"/>
-          <w:sz w:val="24"/>
-          <w:szCs w:val="24"/>
-        </w:rPr>
-        <w:t>N</w:t>
-      </w:r>
-      <w:r>
-        <w:rPr>
-          <w:rStyle w:val="HTMLCode"/>
-          <w:rFonts w:ascii="Times New Roman" w:hAnsi="Times New Roman" w:cs="Times New Roman"/>
-          <w:sz w:val="24"/>
-          <w:szCs w:val="24"/>
-        </w:rPr>
-        <w:t>ã</w:t>
+        <w:t>o</w:t>
       </w:r>
       <w:r>
         <w:rPr>
@@ -537,16 +735,7 @@
           <w:sz w:val="24"/>
           <w:szCs w:val="24"/>
         </w:rPr>
-        <w:t>o</w:t>
-      </w:r>
-      <w:r>
-        <w:rPr>
-          <w:rStyle w:val="HTMLCode"/>
-          <w:rFonts w:ascii="Times New Roman" w:hAnsi="Times New Roman" w:cs="Times New Roman"/>
-          <w:sz w:val="24"/>
-          <w:szCs w:val="24"/>
-        </w:rPr>
-        <w:t xml:space="preserve"> → </w:t>
+        <w:t xml:space="preserve"> </w:t>
       </w:r>
       <w:r>
         <w:rPr>
@@ -555,25 +744,7 @@
           <w:sz w:val="24"/>
           <w:szCs w:val="24"/>
         </w:rPr>
-        <w:t>Processon</w:t>
-      </w:r>
-      <w:r>
-        <w:rPr>
-          <w:rStyle w:val="HTMLCode"/>
-          <w:rFonts w:ascii="Times New Roman" w:hAnsi="Times New Roman" w:cs="Times New Roman"/>
-          <w:sz w:val="24"/>
-          <w:szCs w:val="24"/>
-        </w:rPr>
-        <w:t>ã</w:t>
-      </w:r>
-      <w:r>
-        <w:rPr>
-          <w:rStyle w:val="hljs-variable"/>
-          <w:rFonts w:ascii="Times New Roman" w:hAnsi="Times New Roman" w:cs="Times New Roman"/>
-          <w:sz w:val="24"/>
-          <w:szCs w:val="24"/>
-        </w:rPr>
-        <w:t>oeleg</w:t>
+        <w:t>eleg</w:t>
       </w:r>
       <w:r>
         <w:rPr>
@@ -1014,6 +1185,15 @@
       </w:r>
       <w:r>
         <w:rPr>
+          <w:rStyle w:val="HTMLCode"/>
+          <w:rFonts w:ascii="Times New Roman" w:hAnsi="Times New Roman" w:cs="Times New Roman"/>
+          <w:sz w:val="24"/>
+          <w:szCs w:val="24"/>
+        </w:rPr>
+        <w:t xml:space="preserve"> </w:t>
+      </w:r>
+      <w:r>
+        <w:rPr>
           <w:rStyle w:val="hljs-keyword"/>
           <w:rFonts w:ascii="Times New Roman" w:hAnsi="Times New Roman" w:cs="Times New Roman"/>
           <w:sz w:val="24"/>
@@ -1321,7 +1501,13 @@
         </w:numPr>
       </w:pPr>
       <w:r>
-        <w:t>Impacto socioeconómico</w:t>
+        <w:t>Impacto socio</w:t>
+      </w:r>
+      <w:r>
+        <w:t xml:space="preserve"> </w:t>
+      </w:r>
+      <w:r>
+        <w:t>económico</w:t>
       </w:r>
     </w:p>
     <w:p>
@@ -1806,6 +1992,15 @@
           <w:szCs w:val="24"/>
         </w:rPr>
         <w:t xml:space="preserve"> empréstimo</w:t>
+      </w:r>
+      <w:r>
+        <w:rPr>
+          <w:rStyle w:val="HTMLCode"/>
+          <w:rFonts w:ascii="Times New Roman" w:hAnsi="Times New Roman" w:cs="Times New Roman"/>
+          <w:sz w:val="24"/>
+          <w:szCs w:val="24"/>
+        </w:rPr>
+        <w:t xml:space="preserve"> </w:t>
       </w:r>
     </w:p>
     <w:p>
@@ -3215,7 +3410,7 @@
           <wp:docPr id="7" name="Picture 8" descr="Logo&#10;&#10;Description automatically generated">
             <a:extLst xmlns:a="http://schemas.openxmlformats.org/drawingml/2006/main">
               <a:ext uri="{FF2B5EF4-FFF2-40B4-BE49-F238E27FC236}">
-                <a16:creationId xmlns:a16="http://schemas.microsoft.com/office/drawing/2014/main" xmlns:wps="http://schemas.microsoft.com/office/word/2010/wordprocessingShape" xmlns:wpi="http://schemas.microsoft.com/office/word/2010/wordprocessingInk" xmlns:wpg="http://schemas.microsoft.com/office/word/2010/wordprocessingGroup" xmlns:w16se="http://schemas.microsoft.com/office/word/2015/wordml/symex" xmlns:w15="http://schemas.microsoft.com/office/word/2012/wordml" xmlns:w14="http://schemas.microsoft.com/office/word/2010/wordml" xmlns:w="http://schemas.openxmlformats.org/wordprocessingml/2006/main" xmlns:w10="urn:schemas-microsoft-com:office:word" xmlns:wp14="http://schemas.microsoft.com/office/word/2010/wordprocessingDrawing" xmlns:v="urn:schemas-microsoft-com:vml" xmlns:o="urn:schemas-microsoft-com:office:office" xmlns:mc="http://schemas.openxmlformats.org/markup-compatibility/2006" xmlns:cx="http://schemas.microsoft.com/office/drawing/2014/chartex" xmlns:wpc="http://schemas.microsoft.com/office/word/2010/wordprocessingCanvas" xmlns="" id="{47D722CA-1BDD-467C-B67A-0036DB710927}"/>
+                <a16:creationId xmlns="" xmlns:wpc="http://schemas.microsoft.com/office/word/2010/wordprocessingCanvas" xmlns:cx="http://schemas.microsoft.com/office/drawing/2014/chartex" xmlns:mc="http://schemas.openxmlformats.org/markup-compatibility/2006" xmlns:o="urn:schemas-microsoft-com:office:office" xmlns:v="urn:schemas-microsoft-com:vml" xmlns:wp14="http://schemas.microsoft.com/office/word/2010/wordprocessingDrawing" xmlns:w10="urn:schemas-microsoft-com:office:word" xmlns:w="http://schemas.openxmlformats.org/wordprocessingml/2006/main" xmlns:w14="http://schemas.microsoft.com/office/word/2010/wordml" xmlns:w15="http://schemas.microsoft.com/office/word/2012/wordml" xmlns:w16se="http://schemas.microsoft.com/office/word/2015/wordml/symex" xmlns:wpg="http://schemas.microsoft.com/office/word/2010/wordprocessingGroup" xmlns:wpi="http://schemas.microsoft.com/office/word/2010/wordprocessingInk" xmlns:wps="http://schemas.microsoft.com/office/word/2010/wordprocessingShape" xmlns:a16="http://schemas.microsoft.com/office/drawing/2014/main" id="{47D722CA-1BDD-467C-B67A-0036DB710927}"/>
               </a:ext>
             </a:extLst>
           </wp:docPr>
@@ -3229,7 +3424,7 @@
                   <pic:cNvPr id="9" name="Picture 8" descr="Logo&#10;&#10;Description automatically generated">
                     <a:extLst>
                       <a:ext uri="{FF2B5EF4-FFF2-40B4-BE49-F238E27FC236}">
-                        <a16:creationId xmlns:a16="http://schemas.microsoft.com/office/drawing/2014/main" xmlns:wps="http://schemas.microsoft.com/office/word/2010/wordprocessingShape" xmlns:wpi="http://schemas.microsoft.com/office/word/2010/wordprocessingInk" xmlns:wpg="http://schemas.microsoft.com/office/word/2010/wordprocessingGroup" xmlns:w16se="http://schemas.microsoft.com/office/word/2015/wordml/symex" xmlns:w15="http://schemas.microsoft.com/office/word/2012/wordml" xmlns:w14="http://schemas.microsoft.com/office/word/2010/wordml" xmlns:w="http://schemas.openxmlformats.org/wordprocessingml/2006/main" xmlns:w10="urn:schemas-microsoft-com:office:word" xmlns:wp14="http://schemas.microsoft.com/office/word/2010/wordprocessingDrawing" xmlns:v="urn:schemas-microsoft-com:vml" xmlns:o="urn:schemas-microsoft-com:office:office" xmlns:mc="http://schemas.openxmlformats.org/markup-compatibility/2006" xmlns:cx="http://schemas.microsoft.com/office/drawing/2014/chartex" xmlns:wpc="http://schemas.microsoft.com/office/word/2010/wordprocessingCanvas" xmlns="" id="{47D722CA-1BDD-467C-B67A-0036DB710927}"/>
+                        <a16:creationId xmlns="" xmlns:wpc="http://schemas.microsoft.com/office/word/2010/wordprocessingCanvas" xmlns:cx="http://schemas.microsoft.com/office/drawing/2014/chartex" xmlns:mc="http://schemas.openxmlformats.org/markup-compatibility/2006" xmlns:o="urn:schemas-microsoft-com:office:office" xmlns:v="urn:schemas-microsoft-com:vml" xmlns:wp14="http://schemas.microsoft.com/office/word/2010/wordprocessingDrawing" xmlns:w10="urn:schemas-microsoft-com:office:word" xmlns:w="http://schemas.openxmlformats.org/wordprocessingml/2006/main" xmlns:w14="http://schemas.microsoft.com/office/word/2010/wordml" xmlns:w15="http://schemas.microsoft.com/office/word/2012/wordml" xmlns:w16se="http://schemas.microsoft.com/office/word/2015/wordml/symex" xmlns:wpg="http://schemas.microsoft.com/office/word/2010/wordprocessingGroup" xmlns:wpi="http://schemas.microsoft.com/office/word/2010/wordprocessingInk" xmlns:wps="http://schemas.microsoft.com/office/word/2010/wordprocessingShape" xmlns:a16="http://schemas.microsoft.com/office/drawing/2014/main" id="{47D722CA-1BDD-467C-B67A-0036DB710927}"/>
                       </a:ext>
                     </a:extLst>
                   </pic:cNvPr>
@@ -6146,7 +6341,7 @@
   <a:extraClrSchemeLst/>
   <a:extLst>
     <a:ext uri="{05A4C25C-085E-4340-85A3-A5531E510DB2}">
-      <thm15:themeFamily xmlns:thm15="http://schemas.microsoft.com/office/thememl/2012/main" xmlns="" name="Office Theme" id="{62F939B6-93AF-4DB8-9C6B-D6C7DFDC589F}" vid="{4A3C46E8-61CC-4603-A589-7422A47A8E4A}"/>
+      <thm15:themeFamily xmlns="" xmlns:thm15="http://schemas.microsoft.com/office/thememl/2012/main" name="Office Theme" id="{62F939B6-93AF-4DB8-9C6B-D6C7DFDC589F}" vid="{4A3C46E8-61CC-4603-A589-7422A47A8E4A}"/>
     </a:ext>
   </a:extLst>
 </a:theme>

</xml_diff>